<commit_message>
spec(0000): add-event subtitle copy → all-live (matches code #928)
</commit_message>
<xml_diff>
--- a/0000_app_shell_and_navigation/0000_app_shell_and_navigation.docx
+++ b/0000_app_shell_and_navigation/0000_app_shell_and_navigation.docx
@@ -2110,7 +2110,7 @@
         <w:pStyle w:val="BodyText"/>
       </w:pPr>
       <w:r>
-        <w:t xml:space="preserve">The other nine event types stay visible because they’re a</w:t>
+        <w:t xml:space="preserve">All nine event types in the picker are</w:t>
       </w:r>
       <w:r>
         <w:t xml:space="preserve"> </w:t>
@@ -2120,52 +2120,80 @@
           <w:b/>
           <w:bCs/>
         </w:rPr>
-        <w:t xml:space="preserve">product preview</w:t>
-      </w:r>
-      <w:r>
-        <w:t xml:space="preserve"> </w:t>
-      </w:r>
-      <w:r>
-        <w:t xml:space="preserve">— Setnayan plans to support multiple event types beyond weddings and debuts (each with its own iteration set, eventually), and showing the lineup signals the couple that this is a serious event-platform play, not just a wedding app. When future event types ship, no UI rework is needed — the cards already exist; we just flip the</w:t>
-      </w:r>
-      <w:r>
-        <w:t xml:space="preserve"> </w:t>
-      </w:r>
-      <w:r>
-        <w:rPr>
-          <w:rStyle w:val="VerbatimChar"/>
-        </w:rPr>
-        <w:t xml:space="preserve">enabled</w:t>
-      </w:r>
-      <w:r>
-        <w:t xml:space="preserve"> </w:t>
-      </w:r>
-      <w:r>
-        <w:t xml:space="preserve">flag in the picker config (which turns the grayscale</w:t>
-      </w:r>
-      <w:r>
-        <w:t xml:space="preserve"> </w:t>
-      </w:r>
-      <w:r>
-        <w:t xml:space="preserve">“Coming soon”</w:t>
-      </w:r>
-      <w:r>
-        <w:t xml:space="preserve"> </w:t>
-      </w:r>
-      <w:r>
-        <w:t xml:space="preserve">card into a full-color, tappable</w:t>
-      </w:r>
-      <w:r>
-        <w:t xml:space="preserve"> </w:t>
-      </w:r>
-      <w:r>
-        <w:t xml:space="preserve">“Available”</w:t>
-      </w:r>
-      <w:r>
-        <w:t xml:space="preserve"> </w:t>
-      </w:r>
-      <w:r>
-        <w:t xml:space="preserve">one).</w:t>
+        <w:t xml:space="preserve">live</w:t>
+      </w:r>
+      <w:r>
+        <w:t xml:space="preserve"> </w:t>
+      </w:r>
+      <w:r>
+        <w:t xml:space="preserve">(owner:</w:t>
+      </w:r>
+      <w:r>
+        <w:t xml:space="preserve"> </w:t>
+      </w:r>
+      <w:r>
+        <w:t xml:space="preserve">“keep everything live,”</w:t>
+      </w:r>
+      <w:r>
+        <w:t xml:space="preserve"> </w:t>
+      </w:r>
+      <w:r>
+        <w:t xml:space="preserve">2026-06-03). The lineup still signals Setnayan’s broader</w:t>
+      </w:r>
+      <w:r>
+        <w:t xml:space="preserve"> </w:t>
+      </w:r>
+      <w:r>
+        <w:rPr>
+          <w:b/>
+          <w:bCs/>
+        </w:rPr>
+        <w:t xml:space="preserve">event-platform</w:t>
+      </w:r>
+      <w:r>
+        <w:t xml:space="preserve"> </w:t>
+      </w:r>
+      <w:r>
+        <w:t xml:space="preserve">ambition beyond weddings — more event types get added over time as their iterations mature (Anniversary, Graduation, and Reunion already exist as DB enum values awaiting a picker card + hero photo). Adding one is a picker-config change — a roster entry in</w:t>
+      </w:r>
+      <w:r>
+        <w:t xml:space="preserve"> </w:t>
+      </w:r>
+      <w:r>
+        <w:rPr>
+          <w:rStyle w:val="VerbatimChar"/>
+        </w:rPr>
+        <w:t xml:space="preserve">event-types.ts</w:t>
+      </w:r>
+      <w:r>
+        <w:t xml:space="preserve"> </w:t>
+      </w:r>
+      <w:r>
+        <w:t xml:space="preserve">(</w:t>
+      </w:r>
+      <w:r>
+        <w:rPr>
+          <w:rStyle w:val="VerbatimChar"/>
+        </w:rPr>
+        <w:t xml:space="preserve">enabled: true</w:t>
+      </w:r>
+      <w:r>
+        <w:t xml:space="preserve">) + a</w:t>
+      </w:r>
+      <w:r>
+        <w:t xml:space="preserve"> </w:t>
+      </w:r>
+      <w:r>
+        <w:rPr>
+          <w:rStyle w:val="VerbatimChar"/>
+        </w:rPr>
+        <w:t xml:space="preserve">public/event-types/{type}.webp</w:t>
+      </w:r>
+      <w:r>
+        <w:t xml:space="preserve"> </w:t>
+      </w:r>
+      <w:r>
+        <w:t xml:space="preserve">hero photo — not UI rework.</w:t>
       </w:r>
     </w:p>
     <w:p>
@@ -3567,7 +3595,7 @@
         <w:t xml:space="preserve"> </w:t>
       </w:r>
       <w:r>
-        <w:t xml:space="preserve">row. The in-app add-event sheet copy reads:</w:t>
+        <w:t xml:space="preserve">row → opens the same hero-photo event-type carousel as a bottom sheet (mobile) / popover (desktop), with all nine event types live + tappable. Subtitle:</w:t>
       </w:r>
       <w:r>
         <w:t xml:space="preserve"> </w:t>
@@ -3577,7 +3605,7 @@
           <w:i/>
           <w:iCs/>
         </w:rPr>
-        <w:t xml:space="preserve">“Weddings and debuts are live now. Swipe through to see what’s on the way — more event types unlock over time.”</w:t>
+        <w:t xml:space="preserve">“Swipe through and tap the one you’re planning.”</w:t>
       </w:r>
       <w:r>
         <w:t xml:space="preserve"> </w:t>
@@ -3595,7 +3623,19 @@
         <w:t xml:space="preserve"> </w:t>
       </w:r>
       <w:r>
-        <w:t xml:space="preserve">line was removed 2026-06-03 — no notify flow exists.)</w:t>
+        <w:t xml:space="preserve">copy was removed 2026-06-03 — no notify flow; the</w:t>
+      </w:r>
+      <w:r>
+        <w:t xml:space="preserve"> </w:t>
+      </w:r>
+      <w:r>
+        <w:t xml:space="preserve">“more event types unlock over time”</w:t>
+      </w:r>
+      <w:r>
+        <w:t xml:space="preserve"> </w:t>
+      </w:r>
+      <w:r>
+        <w:t xml:space="preserve">line was replaced 2026-06-04 (#928) to match the all-live state.)</w:t>
       </w:r>
       <w:r>
         <w:t xml:space="preserve"> </w:t>
@@ -9299,31 +9339,7 @@
         </w:numPr>
       </w:pPr>
       <w:r>
-        <w:t xml:space="preserve">Create-event flow shows all eleven event types as full-bleed hero-photo cards in a swipeable horizontal carousel (no infinite loop; arrows + dots assist on desktop);</w:t>
-      </w:r>
-      <w:r>
-        <w:t xml:space="preserve"> </w:t>
-      </w:r>
-      <w:r>
-        <w:t xml:space="preserve">“Wedding”</w:t>
-      </w:r>
-      <w:r>
-        <w:t xml:space="preserve"> </w:t>
-      </w:r>
-      <w:r>
-        <w:t xml:space="preserve">and</w:t>
-      </w:r>
-      <w:r>
-        <w:t xml:space="preserve"> </w:t>
-      </w:r>
-      <w:r>
-        <w:t xml:space="preserve">“Debut”</w:t>
-      </w:r>
-      <w:r>
-        <w:t xml:space="preserve"> </w:t>
-      </w:r>
-      <w:r>
-        <w:t xml:space="preserve">are live and tappable (Wedding → onboarding flow, Debut → create-event form) with a gold</w:t>
+        <w:t xml:space="preserve">Create-event flow shows all nine event types as full-bleed hero-photo cards in a swipeable horizontal carousel (no infinite loop; arrows + dots assist on desktop); all nine are live and tappable (Wedding → onboarding flow, every other type → create-event form) with a gold</w:t>
       </w:r>
       <w:r>
         <w:t xml:space="preserve"> </w:t>
@@ -9335,19 +9351,19 @@
         <w:t xml:space="preserve"> </w:t>
       </w:r>
       <w:r>
-        <w:t xml:space="preserve">badge; the other nine render grayscale with a</w:t>
-      </w:r>
-      <w:r>
-        <w:t xml:space="preserve"> </w:t>
-      </w:r>
-      <w:r>
-        <w:t xml:space="preserve">“Coming soon”</w:t>
-      </w:r>
-      <w:r>
-        <w:t xml:space="preserve"> </w:t>
-      </w:r>
-      <w:r>
-        <w:t xml:space="preserve">badge and are no-ops; on the full-page picker the Event-name input is hidden until a card is picked.</w:t>
+        <w:t xml:space="preserve">badge; there is no</w:t>
+      </w:r>
+      <w:r>
+        <w:t xml:space="preserve"> </w:t>
+      </w:r>
+      <w:r>
+        <w:t xml:space="preserve">“coming soon”</w:t>
+      </w:r>
+      <w:r>
+        <w:t xml:space="preserve"> </w:t>
+      </w:r>
+      <w:r>
+        <w:t xml:space="preserve">tier and no notify flow; on the full-page picker the Event-name input is hidden until a card is picked.</w:t>
       </w:r>
     </w:p>
     <w:p>

</xml_diff>